<commit_message>
This is probablu safer?
</commit_message>
<xml_diff>
--- a/docs/WorkInProgress/Описание.docx
+++ b/docs/WorkInProgress/Описание.docx
@@ -264,7 +264,25 @@
         <w:rPr>
           <w:lang w:val="ru-RU"/>
         </w:rPr>
-        <w:t xml:space="preserve">Разработка серверной части (Ktor + PostgreSQL) для синхронизации общих аптечек и хранения справочника препаратов</w:t>
+        <w:t xml:space="preserve">Разработка серверной части (</w:t>
+      </w:r>
+      <w:r>
+        <w:rPr>
+          <w:lang w:val="en-US"/>
+        </w:rPr>
+        <w:t xml:space="preserve">Spring</w:t>
+      </w:r>
+      <w:r>
+        <w:rPr>
+          <w:lang w:val="en-US"/>
+        </w:rPr>
+        <w:t xml:space="preserve"> </w:t>
+      </w:r>
+      <w:r>
+        <w:rPr>
+          <w:lang w:val="ru-RU"/>
+        </w:rPr>
+        <w:t xml:space="preserve">+ PostgreSQL) для синхронизации общих аптечек и хранения справочника препаратов</w:t>
       </w:r>
       <w:r>
         <w:rPr>
@@ -1103,7 +1121,27 @@
                 <w:szCs w:val="22"/>
                 <w:lang w:val="ru-RU"/>
               </w:rPr>
-              <w:t xml:space="preserve">Реализация REST API на Ktor: эндпоинты для справочника препаратов, синхронизации общих аптечек</w:t>
+              <w:t xml:space="preserve">Реализация REST API на </w:t>
+            </w:r>
+            <w:r>
+              <w:rPr>
+                <w:b w:val="0"/>
+                <w:bCs w:val="0"/>
+                <w:sz w:val="22"/>
+                <w:szCs w:val="22"/>
+                <w:lang w:val="en-US"/>
+              </w:rPr>
+              <w:t xml:space="preserve">Spring</w:t>
+            </w:r>
+            <w:r>
+              <w:rPr>
+                <w:b w:val="0"/>
+                <w:bCs w:val="0"/>
+                <w:sz w:val="22"/>
+                <w:szCs w:val="22"/>
+                <w:lang w:val="ru-RU"/>
+              </w:rPr>
+              <w:t xml:space="preserve">: эндпоинты для справочника препаратов, синхронизации общих аптечек</w:t>
             </w:r>
             <w:r>
               <w:rPr>
@@ -1196,9 +1234,15 @@
             </w:pPr>
             <w:r>
               <w:rPr>
-                <w:lang w:val="ru-RU"/>
-              </w:rPr>
-              <w:t xml:space="preserve">15.02.26</w:t>
+                <w:lang w:val="en-US"/>
+              </w:rPr>
+              <w:t xml:space="preserve">22</w:t>
+            </w:r>
+            <w:r>
+              <w:rPr>
+                <w:lang w:val="ru-RU"/>
+              </w:rPr>
+              <w:t xml:space="preserve">.02.26</w:t>
             </w:r>
             <w:r>
               <w:rPr>
@@ -3710,11 +3754,42 @@
     </w:tbl>
     <w:p>
       <w:pPr>
+        <w:pBdr/>
+        <w:shd w:val="nil"/>
+        <w:spacing/>
+        <w:ind/>
+        <w:rPr>
+          <w:lang w:val="ru-RU"/>
+        </w:rPr>
+      </w:pPr>
+      <w:r>
+        <w:rPr>
+          <w:highlight w:val="none"/>
+          <w:lang w:val="ru-RU"/>
+        </w:rPr>
+        <w:br w:type="page" w:clear="all"/>
+      </w:r>
+      <w:r>
+        <w:rPr>
+          <w:highlight w:val="none"/>
+          <w:lang w:val="ru-RU"/>
+        </w:rPr>
+      </w:r>
+      <w:r>
+        <w:rPr>
+          <w:highlight w:val="none"/>
+          <w:lang w:val="ru-RU"/>
+        </w:rPr>
+      </w:r>
+    </w:p>
+    <w:p>
+      <w:pPr>
         <w:pStyle w:val="896"/>
         <w:pBdr/>
         <w:spacing/>
         <w:ind/>
         <w:rPr>
+          <w:highlight w:val="none"/>
           <w:lang w:val="ru-RU"/>
         </w:rPr>
       </w:pPr>
@@ -3941,14 +4016,9 @@
                 <w:bCs w:val="0"/>
                 <w:sz w:val="22"/>
                 <w:szCs w:val="22"/>
-                <w:lang w:val="ru-RU"/>
-              </w:rPr>
-              <w:t xml:space="preserve">Ktor Server</w:t>
-            </w:r>
-            <w:r>
-              <w:rPr>
-                <w:lang w:val="ru-RU"/>
-              </w:rPr>
+                <w:lang w:val="en-US"/>
+              </w:rPr>
+              <w:t xml:space="preserve">Spring Boot 3</w:t>
             </w:r>
             <w:r>
               <w:rPr>
@@ -3992,10 +4062,23 @@
                 <w:szCs w:val="22"/>
                 <w:lang w:val="ru-RU"/>
               </w:rPr>
-              <w:t xml:space="preserve">Асинхронный веб-фреймворк на Kotlin</w:t>
             </w:r>
             <w:r>
               <w:rPr>
+                <w:b w:val="0"/>
+                <w:bCs w:val="0"/>
+                <w:sz w:val="22"/>
+                <w:szCs w:val="22"/>
+                <w:lang w:val="ru-RU"/>
+              </w:rPr>
+              <w:t xml:space="preserve">Веб-фреймворк на JVM</w:t>
+            </w:r>
+            <w:r>
+              <w:rPr>
+                <w:b w:val="0"/>
+                <w:bCs w:val="0"/>
+                <w:sz w:val="22"/>
+                <w:szCs w:val="22"/>
                 <w:lang w:val="ru-RU"/>
               </w:rPr>
             </w:r>
@@ -4041,12 +4124,27 @@
                 <w:szCs w:val="22"/>
                 <w:lang w:val="ru-RU"/>
               </w:rPr>
-              <w:t xml:space="preserve">Легковесный; нативная поддержка корутин; единый язык с клиентом</w:t>
+              <w:t xml:space="preserve">Современный </w:t>
             </w:r>
             <w:r>
               <w:rPr>
-                <w:lang w:val="ru-RU"/>
-              </w:rPr>
+                <w:b w:val="0"/>
+                <w:bCs w:val="0"/>
+                <w:sz w:val="22"/>
+                <w:szCs w:val="22"/>
+                <w:lang w:val="en-US"/>
+              </w:rPr>
+              <w:t xml:space="preserve">Kotlin-first class support </w:t>
+            </w:r>
+            <w:r>
+              <w:rPr>
+                <w:b w:val="0"/>
+                <w:bCs w:val="0"/>
+                <w:sz w:val="22"/>
+                <w:szCs w:val="22"/>
+                <w:lang w:val="ru-RU"/>
+              </w:rPr>
+              <w:t xml:space="preserve">фреймворк, со зрелой экосистемой и обширными возможностями</w:t>
             </w:r>
             <w:r>
               <w:rPr>
@@ -4243,12 +4341,26 @@
                 <w:szCs w:val="22"/>
                 <w:lang w:val="ru-RU"/>
               </w:rPr>
-              <w:t xml:space="preserve">Exposed</w:t>
             </w:r>
             <w:r>
               <w:rPr>
-                <w:lang w:val="ru-RU"/>
-              </w:rPr>
+                <w:b w:val="0"/>
+                <w:bCs w:val="0"/>
+                <w:sz w:val="22"/>
+                <w:szCs w:val="22"/>
+                <w:lang w:val="ru-RU"/>
+              </w:rPr>
+              <w:t xml:space="preserve">Spring Data JPA + Hiberna</w:t>
+            </w:r>
+            <w:r>
+              <w:rPr>
+                <w:b w:val="0"/>
+                <w:bCs w:val="0"/>
+                <w:sz w:val="22"/>
+                <w:szCs w:val="22"/>
+                <w:lang w:val="en-US"/>
+              </w:rPr>
+              <w:t xml:space="preserve">te</w:t>
             </w:r>
             <w:r>
               <w:rPr>
@@ -4292,10 +4404,23 @@
                 <w:szCs w:val="22"/>
                 <w:lang w:val="ru-RU"/>
               </w:rPr>
-              <w:t xml:space="preserve">ORM от JetBrains</w:t>
             </w:r>
             <w:r>
               <w:rPr>
+                <w:b w:val="0"/>
+                <w:bCs w:val="0"/>
+                <w:sz w:val="22"/>
+                <w:szCs w:val="22"/>
+                <w:lang w:val="ru-RU"/>
+              </w:rPr>
+              <w:t xml:space="preserve">ORM</w:t>
+            </w:r>
+            <w:r>
+              <w:rPr>
+                <w:b w:val="0"/>
+                <w:bCs w:val="0"/>
+                <w:sz w:val="22"/>
+                <w:szCs w:val="22"/>
                 <w:lang w:val="ru-RU"/>
               </w:rPr>
             </w:r>
@@ -4341,12 +4466,37 @@
                 <w:szCs w:val="22"/>
                 <w:lang w:val="ru-RU"/>
               </w:rPr>
-              <w:t xml:space="preserve">Type-safe DSL для SQL; нативная интеграция с Kotlin</w:t>
+              <w:t xml:space="preserve">Стандартный </w:t>
             </w:r>
             <w:r>
               <w:rPr>
-                <w:lang w:val="ru-RU"/>
-              </w:rPr>
+                <w:b w:val="0"/>
+                <w:bCs w:val="0"/>
+                <w:sz w:val="22"/>
+                <w:szCs w:val="22"/>
+                <w:lang w:val="en-US"/>
+              </w:rPr>
+              <w:t xml:space="preserve">ORM </w:t>
+            </w:r>
+            <w:r>
+              <w:rPr>
+                <w:b w:val="0"/>
+                <w:bCs w:val="0"/>
+                <w:sz w:val="22"/>
+                <w:szCs w:val="22"/>
+                <w:lang w:val="ru-RU"/>
+              </w:rPr>
+              <w:t xml:space="preserve">стек для </w:t>
+            </w:r>
+            <w:r>
+              <w:rPr>
+                <w:b w:val="0"/>
+                <w:bCs w:val="0"/>
+                <w:sz w:val="22"/>
+                <w:szCs w:val="22"/>
+                <w:lang w:val="en-US"/>
+              </w:rPr>
+              <w:t xml:space="preserve">Spring</w:t>
             </w:r>
             <w:r>
               <w:rPr>
@@ -4393,7 +4543,7 @@
                 <w:szCs w:val="22"/>
                 <w:lang w:val="ru-RU"/>
               </w:rPr>
-              <w:t xml:space="preserve">Flyway</w:t>
+              <w:t xml:space="preserve">OpenAPI/Swagger</w:t>
             </w:r>
             <w:r>
               <w:rPr>
@@ -4442,307 +4592,17 @@
                 <w:szCs w:val="22"/>
                 <w:lang w:val="ru-RU"/>
               </w:rPr>
-              <w:t xml:space="preserve">Миграции базы данных</w:t>
+              <w:t xml:space="preserve">Документация API</w:t>
             </w:r>
-            <w:r>
-              <w:rPr>
-                <w:lang w:val="ru-RU"/>
-              </w:rPr>
-            </w:r>
-            <w:r>
-              <w:rPr>
-                <w:lang w:val="ru-RU"/>
-              </w:rPr>
-            </w:r>
-          </w:p>
-        </w:tc>
-        <w:tc>
-          <w:tcPr>
-            <w:tcBorders>
-              <w:top w:val="single" w:color="000000" w:sz="1" w:space="0"/>
-              <w:left w:val="single" w:color="000000" w:sz="1" w:space="0"/>
-              <w:bottom w:val="single" w:color="000000" w:sz="1" w:space="0"/>
-              <w:right w:val="single" w:color="000000" w:sz="1" w:space="0"/>
-            </w:tcBorders>
-            <w:tcMar>
-              <w:left w:w="120" w:type="dxa"/>
-              <w:top w:w="80" w:type="dxa"/>
-              <w:right w:w="120" w:type="dxa"/>
-              <w:bottom w:w="80" w:type="dxa"/>
-            </w:tcMar>
-            <w:tcW w:w="3826" w:type="dxa"/>
-            <w:textDirection w:val="lrTb"/>
-            <w:noWrap w:val="false"/>
-          </w:tcPr>
-          <w:p>
-            <w:pPr>
-              <w:pBdr/>
-              <w:spacing/>
-              <w:ind/>
-              <w:rPr>
-                <w:lang w:val="ru-RU"/>
-              </w:rPr>
-            </w:pPr>
             <w:r>
               <w:rPr>
                 <w:b w:val="0"/>
                 <w:bCs w:val="0"/>
                 <w:sz w:val="22"/>
                 <w:szCs w:val="22"/>
-                <w:lang w:val="ru-RU"/>
-              </w:rPr>
-              <w:t xml:space="preserve">SQL-first подход; версионирование схемы</w:t>
-            </w:r>
-            <w:r>
-              <w:rPr>
-                <w:lang w:val="ru-RU"/>
-              </w:rPr>
-            </w:r>
-            <w:r>
-              <w:rPr>
-                <w:lang w:val="ru-RU"/>
-              </w:rPr>
-            </w:r>
-          </w:p>
-        </w:tc>
-      </w:tr>
-      <w:tr>
-        <w:trPr/>
-        <w:tc>
-          <w:tcPr>
-            <w:tcBorders>
-              <w:top w:val="single" w:color="000000" w:sz="1" w:space="0"/>
-              <w:left w:val="single" w:color="000000" w:sz="1" w:space="0"/>
-              <w:bottom w:val="single" w:color="000000" w:sz="1" w:space="0"/>
-              <w:right w:val="single" w:color="000000" w:sz="1" w:space="0"/>
-            </w:tcBorders>
-            <w:tcMar>
-              <w:left w:w="120" w:type="dxa"/>
-              <w:top w:w="80" w:type="dxa"/>
-              <w:right w:w="120" w:type="dxa"/>
-              <w:bottom w:w="80" w:type="dxa"/>
-            </w:tcMar>
-            <w:tcW w:w="2200" w:type="dxa"/>
-            <w:textDirection w:val="lrTb"/>
-            <w:noWrap w:val="false"/>
-          </w:tcPr>
-          <w:p>
-            <w:pPr>
-              <w:pBdr/>
-              <w:spacing/>
-              <w:ind/>
-              <w:rPr>
-                <w:lang w:val="ru-RU"/>
-              </w:rPr>
-            </w:pPr>
-            <w:r>
-              <w:rPr>
-                <w:b w:val="0"/>
-                <w:bCs w:val="0"/>
-                <w:sz w:val="22"/>
-                <w:szCs w:val="22"/>
-                <w:lang w:val="ru-RU"/>
-              </w:rPr>
-              <w:t xml:space="preserve">Koin</w:t>
-            </w:r>
-            <w:r>
-              <w:rPr>
-                <w:lang w:val="ru-RU"/>
-              </w:rPr>
-            </w:r>
-            <w:r>
-              <w:rPr>
-                <w:lang w:val="ru-RU"/>
-              </w:rPr>
-            </w:r>
-          </w:p>
-        </w:tc>
-        <w:tc>
-          <w:tcPr>
-            <w:tcBorders>
-              <w:top w:val="single" w:color="000000" w:sz="1" w:space="0"/>
-              <w:left w:val="single" w:color="000000" w:sz="1" w:space="0"/>
-              <w:bottom w:val="single" w:color="000000" w:sz="1" w:space="0"/>
-              <w:right w:val="single" w:color="000000" w:sz="1" w:space="0"/>
-            </w:tcBorders>
-            <w:tcMar>
-              <w:left w:w="120" w:type="dxa"/>
-              <w:top w:w="80" w:type="dxa"/>
-              <w:right w:w="120" w:type="dxa"/>
-              <w:bottom w:w="80" w:type="dxa"/>
-            </w:tcMar>
-            <w:tcW w:w="3000" w:type="dxa"/>
-            <w:textDirection w:val="lrTb"/>
-            <w:noWrap w:val="false"/>
-          </w:tcPr>
-          <w:p>
-            <w:pPr>
-              <w:pBdr/>
-              <w:spacing/>
-              <w:ind/>
-              <w:rPr>
-                <w:lang w:val="ru-RU"/>
-              </w:rPr>
-            </w:pPr>
-            <w:r>
-              <w:rPr>
-                <w:b w:val="0"/>
-                <w:bCs w:val="0"/>
-                <w:sz w:val="22"/>
-                <w:szCs w:val="22"/>
-                <w:lang w:val="ru-RU"/>
-              </w:rPr>
-              <w:t xml:space="preserve">Dependency Injection</w:t>
-            </w:r>
-            <w:r>
-              <w:rPr>
-                <w:lang w:val="ru-RU"/>
-              </w:rPr>
-            </w:r>
-            <w:r>
-              <w:rPr>
-                <w:lang w:val="ru-RU"/>
-              </w:rPr>
-            </w:r>
-          </w:p>
-        </w:tc>
-        <w:tc>
-          <w:tcPr>
-            <w:tcBorders>
-              <w:top w:val="single" w:color="000000" w:sz="1" w:space="0"/>
-              <w:left w:val="single" w:color="000000" w:sz="1" w:space="0"/>
-              <w:bottom w:val="single" w:color="000000" w:sz="1" w:space="0"/>
-              <w:right w:val="single" w:color="000000" w:sz="1" w:space="0"/>
-            </w:tcBorders>
-            <w:tcMar>
-              <w:left w:w="120" w:type="dxa"/>
-              <w:top w:w="80" w:type="dxa"/>
-              <w:right w:w="120" w:type="dxa"/>
-              <w:bottom w:w="80" w:type="dxa"/>
-            </w:tcMar>
-            <w:tcW w:w="3826" w:type="dxa"/>
-            <w:textDirection w:val="lrTb"/>
-            <w:noWrap w:val="false"/>
-          </w:tcPr>
-          <w:p>
-            <w:pPr>
-              <w:pBdr/>
-              <w:spacing/>
-              <w:ind/>
-              <w:rPr>
-                <w:lang w:val="ru-RU"/>
-              </w:rPr>
-            </w:pPr>
-            <w:r>
-              <w:rPr>
-                <w:b w:val="0"/>
-                <w:bCs w:val="0"/>
-                <w:sz w:val="22"/>
-                <w:szCs w:val="22"/>
-                <w:lang w:val="ru-RU"/>
-              </w:rPr>
-              <w:t xml:space="preserve">Легковесный; DSL-конфигурация; не требует кодогенерации</w:t>
-            </w:r>
-            <w:r>
-              <w:rPr>
-                <w:lang w:val="ru-RU"/>
-              </w:rPr>
-            </w:r>
-            <w:r>
-              <w:rPr>
-                <w:lang w:val="ru-RU"/>
-              </w:rPr>
-            </w:r>
-          </w:p>
-        </w:tc>
-      </w:tr>
-      <w:tr>
-        <w:trPr/>
-        <w:tc>
-          <w:tcPr>
-            <w:tcBorders>
-              <w:top w:val="single" w:color="000000" w:sz="1" w:space="0"/>
-              <w:left w:val="single" w:color="000000" w:sz="1" w:space="0"/>
-              <w:bottom w:val="single" w:color="000000" w:sz="1" w:space="0"/>
-              <w:right w:val="single" w:color="000000" w:sz="1" w:space="0"/>
-            </w:tcBorders>
-            <w:tcMar>
-              <w:left w:w="120" w:type="dxa"/>
-              <w:top w:w="80" w:type="dxa"/>
-              <w:right w:w="120" w:type="dxa"/>
-              <w:bottom w:w="80" w:type="dxa"/>
-            </w:tcMar>
-            <w:tcW w:w="2200" w:type="dxa"/>
-            <w:textDirection w:val="lrTb"/>
-            <w:noWrap w:val="false"/>
-          </w:tcPr>
-          <w:p>
-            <w:pPr>
-              <w:pBdr/>
-              <w:spacing/>
-              <w:ind/>
-              <w:rPr>
-                <w:lang w:val="ru-RU"/>
-              </w:rPr>
-            </w:pPr>
-            <w:r>
-              <w:rPr>
-                <w:b w:val="0"/>
-                <w:bCs w:val="0"/>
-                <w:sz w:val="22"/>
-                <w:szCs w:val="22"/>
-                <w:lang w:val="ru-RU"/>
-              </w:rPr>
-              <w:t xml:space="preserve">Ktor OpenAPI/Swagger</w:t>
-            </w:r>
-            <w:r>
-              <w:rPr>
-                <w:lang w:val="ru-RU"/>
-              </w:rPr>
-            </w:r>
-            <w:r>
-              <w:rPr>
-                <w:lang w:val="ru-RU"/>
-              </w:rPr>
-            </w:r>
-          </w:p>
-        </w:tc>
-        <w:tc>
-          <w:tcPr>
-            <w:tcBorders>
-              <w:top w:val="single" w:color="000000" w:sz="1" w:space="0"/>
-              <w:left w:val="single" w:color="000000" w:sz="1" w:space="0"/>
-              <w:bottom w:val="single" w:color="000000" w:sz="1" w:space="0"/>
-              <w:right w:val="single" w:color="000000" w:sz="1" w:space="0"/>
-            </w:tcBorders>
-            <w:tcMar>
-              <w:left w:w="120" w:type="dxa"/>
-              <w:top w:w="80" w:type="dxa"/>
-              <w:right w:w="120" w:type="dxa"/>
-              <w:bottom w:w="80" w:type="dxa"/>
-            </w:tcMar>
-            <w:tcW w:w="3000" w:type="dxa"/>
-            <w:textDirection w:val="lrTb"/>
-            <w:noWrap w:val="false"/>
-          </w:tcPr>
-          <w:p>
-            <w:pPr>
-              <w:pBdr/>
-              <w:spacing/>
-              <w:ind/>
-              <w:rPr>
-                <w:lang w:val="ru-RU"/>
-              </w:rPr>
-            </w:pPr>
-            <w:r>
-              <w:rPr>
-                <w:b w:val="0"/>
-                <w:bCs w:val="0"/>
-                <w:sz w:val="22"/>
-                <w:szCs w:val="22"/>
-                <w:lang w:val="ru-RU"/>
-              </w:rPr>
-              <w:t xml:space="preserve">Документация API</w:t>
+                <w:lang w:val="en-US"/>
+              </w:rPr>
+              <w:t xml:space="preserve"> </w:t>
             </w:r>
             <w:r>
               <w:rPr>
@@ -5449,50 +5309,48 @@
     </w:p>
     <w:p>
       <w:pPr>
-        <w:pBdr/>
-        <w:spacing w:after="120"/>
-        <w:ind/>
-        <w:rPr>
-          <w:lang w:val="ru-RU"/>
-        </w:rPr>
+        <w:pBdr>
+          <w:top w:val="none" w:color="000000" w:sz="4" w:space="0"/>
+          <w:left w:val="none" w:color="000000" w:sz="4" w:space="0"/>
+          <w:bottom w:val="none" w:color="000000" w:sz="4" w:space="0"/>
+          <w:right w:val="none" w:color="000000" w:sz="4" w:space="0"/>
+        </w:pBdr>
+        <w:spacing/>
+        <w:ind w:right="0" w:firstLine="0" w:left="0"/>
+        <w:rPr/>
       </w:pPr>
       <w:r>
         <w:rPr>
+          <w:rFonts w:ascii="Times New Roman" w:hAnsi="Times New Roman" w:eastAsia="Times New Roman" w:cs="Times New Roman"/>
           <w:b/>
-          <w:bCs/>
-          <w:lang w:val="ru-RU"/>
+          <w:color w:val="000000"/>
+          <w:sz w:val="24"/>
         </w:rPr>
-        <w:t xml:space="preserve">Ktor вместо Spring </w:t>
+        <w:t xml:space="preserve">Spring Boot вместо Ktor для backend.</w:t>
       </w:r>
       <w:r>
         <w:rPr>
-          <w:lang w:val="ru-RU"/>
+          <w:rFonts w:ascii="Times New Roman" w:hAnsi="Times New Roman" w:eastAsia="Times New Roman" w:cs="Times New Roman"/>
+          <w:color w:val="000000"/>
+          <w:sz w:val="24"/>
         </w:rPr>
-        <w:t xml:space="preserve">для backend: Ktor значительно легковеснее. Быстрее работает, более </w:t>
+        <w:t xml:space="preserve"> Первоначально рассматривался Ktor как более лёгкий и идиоматичный для Kotlin фреймворк. Однако его документация ориентирована </w:t>
       </w:r>
       <w:r>
         <w:rPr>
-          <w:lang w:val="en-US"/>
+          <w:rFonts w:ascii="Times New Roman" w:hAnsi="Times New Roman" w:eastAsia="Times New Roman" w:cs="Times New Roman"/>
+          <w:color w:val="000000"/>
+          <w:sz w:val="24"/>
         </w:rPr>
-        <w:t xml:space="preserve">concise </w:t>
+        <w:t xml:space="preserve">крайне отрывочна и скудна, в целом для его сообщество намного меньше, что кардинально усложняет, как разработку, так и изучение этой технологии</w:t>
       </w:r>
       <w:r>
         <w:rPr>
-          <w:lang w:val="ru-RU"/>
+          <w:rFonts w:ascii="Times New Roman" w:hAnsi="Times New Roman" w:eastAsia="Times New Roman" w:cs="Times New Roman"/>
+          <w:color w:val="000000"/>
+          <w:sz w:val="24"/>
         </w:rPr>
-        <w:t xml:space="preserve">код, что означет более быструю разработку. Так как, сервер не выполняет сложных операций более тяжеловесный </w:t>
-      </w:r>
-      <w:r>
-        <w:rPr>
-          <w:lang w:val="en-US"/>
-        </w:rPr>
-        <w:t xml:space="preserve">Spring </w:t>
-      </w:r>
-      <w:r>
-        <w:rPr>
-          <w:lang w:val="ru-RU"/>
-        </w:rPr>
-        <w:t xml:space="preserve">не оправдан.</w:t>
+        <w:t xml:space="preserve">. Spring Boot предоставляет взрослую экосистему с единой документацией и активным большим сообществом что оказалось решающим фактором при самостоятельной разработке в рамках курсовой работы.</w:t>
       </w:r>
       <w:r>
         <w:rPr>
@@ -5501,7 +5359,8 @@
       </w:r>
       <w:r>
         <w:rPr>
-          <w:lang w:val="ru-RU"/>
+          <w:rFonts w:ascii="Times New Roman" w:hAnsi="Times New Roman" w:eastAsia="Times New Roman" w:cs="Times New Roman"/>
+          <w:sz w:val="24"/>
         </w:rPr>
       </w:r>
     </w:p>
@@ -5531,6 +5390,7 @@
       </w:r>
       <w:r>
         <w:rPr>
+          <w:highlight w:val="none"/>
           <w:lang w:val="ru-RU"/>
         </w:rPr>
       </w:r>

</xml_diff>